<commit_message>
Full prose constraint audit — fix all repetitive sentence patterns across 5 briefings
B02: break three consecutive "[Discipline] asks" sentences — vary middle to "examines"
B03: fix introduced Policy/Policy repetition in p7; collapse five "[X] can [verb]" sentences in p12 into one compound sentence preserving bold formatting
B04: merge three "A [noun] may [verb]" sentences in p3; collapse six "[Subject] are [verbed]" sentences in p4 into three
B05: replace four "A [noun] [verb]s" sentences in p2 with colon-introduced list; collapse five "[noun phrase] [verb]s" sentences in p13 into one compound sentence

Co-Authored-By: Claude Sonnet 4.6 <noreply@anthropic.com>
</commit_message>
<xml_diff>
--- a/briefings-source/Strategic_Intelligence_Briefing_03.docx
+++ b/briefings-source/Strategic_Intelligence_Briefing_03.docx
@@ -355,7 +355,7 @@
         <w:rPr>
           <w:rFonts w:ascii="Aptos" w:hAnsi="Aptos"/>
         </w:rPr>
-        <w:t>Policy trackers stop too early. Policy language can define expectations, but it does not guarantee that the right authority holder saw the AI influence, applied the correct condition, and approved the action before the workflow continued. The enterprise can have strong policy language and still lack an enforceable decision path.</w:t>
+        <w:t>Policy trackers stop too early. Written policy can define expectations, but it does not guarantee that the right authority holder saw the AI influence, applied the correct condition, and approved the action before the workflow continued. The enterprise can have strong policy language and still lack an enforceable decision path.</w:t>
       </w:r>
     </w:p>
     <w:p>
@@ -460,7 +460,7 @@
         <w:rPr>
           <w:rFonts w:ascii="Aptos" w:hAnsi="Aptos"/>
         </w:rPr>
-        <w:t xml:space="preserve">The category conversation needs to be sharper. AI governance can establish the program. Model governance can manage the system. Compliance can interpret obligations. Internal audit can test the </w:t>
+        <w:t xml:space="preserve">The category conversation needs to be sharper. AI governance establishes the program, model governance manages the system, compliance interprets obligations, internal audit tests the </w:t>
       </w:r>
       <w:proofErr w:type="gramStart"/>
       <w:r>
@@ -474,7 +474,7 @@
         <w:rPr>
           <w:rFonts w:ascii="Aptos" w:hAnsi="Aptos"/>
         </w:rPr>
-        <w:t>. Decision Intelligence can improve how decisions are modeled and executed. Decision Governance has to address whether AI participation changed the authority requirements attached to the decision path.</w:t>
+        <w:t>, and Decision Intelligence improves how decisions are modeled and executed. Decision Governance has to address whether AI participation changed the authority requirements attached to the decision path.</w:t>
       </w:r>
     </w:p>
     <w:p>

</xml_diff>